<commit_message>
execute cleaner and chunks
</commit_message>
<xml_diff>
--- a/PruebasEntornoLocal.docx
+++ b/PruebasEntornoLocal.docx
@@ -13,11 +13,13 @@
       <w:r>
         <w:t>Instalación de ambientes dev:</w:t>
       </w:r>
-      <w:bookmarkStart w:id="0" w:name="_GoBack"/>
-      <w:bookmarkEnd w:id="0"/>
     </w:p>
     <w:p>
       <w:r>
+        <w:rPr>
+          <w:noProof/>
+          <w:lang w:eastAsia="es-PE"/>
+        </w:rPr>
         <w:drawing>
           <wp:inline distT="0" distB="0" distL="0" distR="0" wp14:anchorId="773C81D0" wp14:editId="5890123C">
             <wp:extent cx="5400040" cy="2915285"/>
@@ -78,6 +80,10 @@
     </w:p>
     <w:p>
       <w:r>
+        <w:rPr>
+          <w:noProof/>
+          <w:lang w:eastAsia="es-PE"/>
+        </w:rPr>
         <w:drawing>
           <wp:inline distT="0" distB="0" distL="0" distR="0" wp14:anchorId="2CABB1AA" wp14:editId="58143B9F">
             <wp:extent cx="5400040" cy="2778125"/>
@@ -103,6 +109,52 @@
                     <a:xfrm>
                       <a:off x="0" y="0"/>
                       <a:ext cx="5400040" cy="2778125"/>
+                    </a:xfrm>
+                    <a:prstGeom prst="rect">
+                      <a:avLst/>
+                    </a:prstGeom>
+                  </pic:spPr>
+                </pic:pic>
+              </a:graphicData>
+            </a:graphic>
+          </wp:inline>
+        </w:drawing>
+      </w:r>
+    </w:p>
+    <w:p>
+      <w:r>
+        <w:t>3. Limpieza de datos y normalizacion</w:t>
+      </w:r>
+      <w:bookmarkStart w:id="0" w:name="_GoBack"/>
+      <w:bookmarkEnd w:id="0"/>
+    </w:p>
+    <w:p>
+      <w:r>
+        <w:drawing>
+          <wp:inline distT="0" distB="0" distL="0" distR="0" wp14:anchorId="3CEEB5C2" wp14:editId="510D9A7C">
+            <wp:extent cx="5400040" cy="1478280"/>
+            <wp:effectExtent l="0" t="0" r="0" b="7620"/>
+            <wp:docPr id="3" name="Imagen 3"/>
+            <wp:cNvGraphicFramePr>
+              <a:graphicFrameLocks xmlns:a="http://schemas.openxmlformats.org/drawingml/2006/main" noChangeAspect="1"/>
+            </wp:cNvGraphicFramePr>
+            <a:graphic xmlns:a="http://schemas.openxmlformats.org/drawingml/2006/main">
+              <a:graphicData uri="http://schemas.openxmlformats.org/drawingml/2006/picture">
+                <pic:pic xmlns:pic="http://schemas.openxmlformats.org/drawingml/2006/picture">
+                  <pic:nvPicPr>
+                    <pic:cNvPr id="1" name=""/>
+                    <pic:cNvPicPr/>
+                  </pic:nvPicPr>
+                  <pic:blipFill>
+                    <a:blip r:embed="rId7"/>
+                    <a:stretch>
+                      <a:fillRect/>
+                    </a:stretch>
+                  </pic:blipFill>
+                  <pic:spPr>
+                    <a:xfrm>
+                      <a:off x="0" y="0"/>
+                      <a:ext cx="5400040" cy="1478280"/>
                     </a:xfrm>
                     <a:prstGeom prst="rect">
                       <a:avLst/>

</xml_diff>

<commit_message>
execute stage dataset builder
</commit_message>
<xml_diff>
--- a/PruebasEntornoLocal.docx
+++ b/PruebasEntornoLocal.docx
@@ -123,10 +123,13 @@
     </w:p>
     <w:p>
       <w:r>
-        <w:t>3. Limpieza de datos y normalizacion</w:t>
-      </w:r>
-      <w:bookmarkStart w:id="0" w:name="_GoBack"/>
-      <w:bookmarkEnd w:id="0"/>
+        <w:t xml:space="preserve">3. Limpieza de datos y </w:t>
+      </w:r>
+      <w:proofErr w:type="spellStart"/>
+      <w:r>
+        <w:t>normalizacion</w:t>
+      </w:r>
+      <w:proofErr w:type="spellEnd"/>
     </w:p>
     <w:p>
       <w:r>
@@ -155,6 +158,123 @@
                     <a:xfrm>
                       <a:off x="0" y="0"/>
                       <a:ext cx="5400040" cy="1478280"/>
+                    </a:xfrm>
+                    <a:prstGeom prst="rect">
+                      <a:avLst/>
+                    </a:prstGeom>
+                  </pic:spPr>
+                </pic:pic>
+              </a:graphicData>
+            </a:graphic>
+          </wp:inline>
+        </w:drawing>
+      </w:r>
+    </w:p>
+    <w:p>
+      <w:r>
+        <w:br w:type="page"/>
+      </w:r>
+    </w:p>
+    <w:p>
+      <w:r>
+        <w:lastRenderedPageBreak/>
+        <w:t xml:space="preserve">4. </w:t>
+      </w:r>
+      <w:proofErr w:type="spellStart"/>
+      <w:r>
+        <w:t>Generacion</w:t>
+      </w:r>
+      <w:proofErr w:type="spellEnd"/>
+      <w:r>
+        <w:t xml:space="preserve"> de </w:t>
+      </w:r>
+      <w:proofErr w:type="spellStart"/>
+      <w:r>
+        <w:t>chunks</w:t>
+      </w:r>
+      <w:proofErr w:type="spellEnd"/>
+    </w:p>
+    <w:p>
+      <w:r>
+        <w:drawing>
+          <wp:inline distT="0" distB="0" distL="0" distR="0" wp14:anchorId="5B149496" wp14:editId="16DE2635">
+            <wp:extent cx="5400040" cy="2594610"/>
+            <wp:effectExtent l="0" t="0" r="0" b="0"/>
+            <wp:docPr id="4" name="Imagen 4"/>
+            <wp:cNvGraphicFramePr>
+              <a:graphicFrameLocks xmlns:a="http://schemas.openxmlformats.org/drawingml/2006/main" noChangeAspect="1"/>
+            </wp:cNvGraphicFramePr>
+            <a:graphic xmlns:a="http://schemas.openxmlformats.org/drawingml/2006/main">
+              <a:graphicData uri="http://schemas.openxmlformats.org/drawingml/2006/picture">
+                <pic:pic xmlns:pic="http://schemas.openxmlformats.org/drawingml/2006/picture">
+                  <pic:nvPicPr>
+                    <pic:cNvPr id="1" name=""/>
+                    <pic:cNvPicPr/>
+                  </pic:nvPicPr>
+                  <pic:blipFill>
+                    <a:blip r:embed="rId8"/>
+                    <a:stretch>
+                      <a:fillRect/>
+                    </a:stretch>
+                  </pic:blipFill>
+                  <pic:spPr>
+                    <a:xfrm>
+                      <a:off x="0" y="0"/>
+                      <a:ext cx="5400040" cy="2594610"/>
+                    </a:xfrm>
+                    <a:prstGeom prst="rect">
+                      <a:avLst/>
+                    </a:prstGeom>
+                  </pic:spPr>
+                </pic:pic>
+              </a:graphicData>
+            </a:graphic>
+          </wp:inline>
+        </w:drawing>
+      </w:r>
+    </w:p>
+    <w:p>
+      <w:r>
+        <w:t xml:space="preserve">5. </w:t>
+      </w:r>
+      <w:r>
+        <w:t>Generar pares Pregunta-Respuesta para fine-</w:t>
+      </w:r>
+      <w:proofErr w:type="spellStart"/>
+      <w:r>
+        <w:t>tuning</w:t>
+      </w:r>
+      <w:proofErr w:type="spellEnd"/>
+    </w:p>
+    <w:p>
+      <w:bookmarkStart w:id="0" w:name="_GoBack"/>
+      <w:bookmarkEnd w:id="0"/>
+      <w:r>
+        <w:drawing>
+          <wp:inline distT="0" distB="0" distL="0" distR="0" wp14:anchorId="7F4E6BFA" wp14:editId="1DB08870">
+            <wp:extent cx="5400040" cy="2349500"/>
+            <wp:effectExtent l="0" t="0" r="0" b="0"/>
+            <wp:docPr id="5" name="Imagen 5"/>
+            <wp:cNvGraphicFramePr>
+              <a:graphicFrameLocks xmlns:a="http://schemas.openxmlformats.org/drawingml/2006/main" noChangeAspect="1"/>
+            </wp:cNvGraphicFramePr>
+            <a:graphic xmlns:a="http://schemas.openxmlformats.org/drawingml/2006/main">
+              <a:graphicData uri="http://schemas.openxmlformats.org/drawingml/2006/picture">
+                <pic:pic xmlns:pic="http://schemas.openxmlformats.org/drawingml/2006/picture">
+                  <pic:nvPicPr>
+                    <pic:cNvPr id="1" name=""/>
+                    <pic:cNvPicPr/>
+                  </pic:nvPicPr>
+                  <pic:blipFill>
+                    <a:blip r:embed="rId9"/>
+                    <a:stretch>
+                      <a:fillRect/>
+                    </a:stretch>
+                  </pic:blipFill>
+                  <pic:spPr>
+                    <a:xfrm>
+                      <a:off x="0" y="0"/>
+                      <a:ext cx="5400040" cy="2349500"/>
                     </a:xfrm>
                     <a:prstGeom prst="rect">
                       <a:avLst/>
@@ -706,6 +826,61 @@
       <w:contextualSpacing/>
     </w:pPr>
   </w:style>
+  <w:style w:type="paragraph" w:styleId="HTMLconformatoprevio">
+    <w:name w:val="HTML Preformatted"/>
+    <w:basedOn w:val="Normal"/>
+    <w:link w:val="HTMLconformatoprevioCar"/>
+    <w:uiPriority w:val="99"/>
+    <w:semiHidden/>
+    <w:unhideWhenUsed/>
+    <w:rsid w:val="006E7632"/>
+    <w:pPr>
+      <w:tabs>
+        <w:tab w:val="left" w:pos="916"/>
+        <w:tab w:val="left" w:pos="1832"/>
+        <w:tab w:val="left" w:pos="2748"/>
+        <w:tab w:val="left" w:pos="3664"/>
+        <w:tab w:val="left" w:pos="4580"/>
+        <w:tab w:val="left" w:pos="5496"/>
+        <w:tab w:val="left" w:pos="6412"/>
+        <w:tab w:val="left" w:pos="7328"/>
+        <w:tab w:val="left" w:pos="8244"/>
+        <w:tab w:val="left" w:pos="9160"/>
+        <w:tab w:val="left" w:pos="10076"/>
+        <w:tab w:val="left" w:pos="10992"/>
+        <w:tab w:val="left" w:pos="11908"/>
+        <w:tab w:val="left" w:pos="12824"/>
+        <w:tab w:val="left" w:pos="13740"/>
+        <w:tab w:val="left" w:pos="14656"/>
+      </w:tabs>
+      <w:spacing w:after="0" w:line="240" w:lineRule="auto"/>
+    </w:pPr>
+    <w:rPr>
+      <w:rFonts w:ascii="Courier New" w:eastAsia="Times New Roman" w:hAnsi="Courier New" w:cs="Courier New"/>
+      <w:sz w:val="20"/>
+      <w:szCs w:val="20"/>
+      <w:lang w:eastAsia="es-PE"/>
+    </w:rPr>
+  </w:style>
+  <w:style w:type="character" w:customStyle="1" w:styleId="HTMLconformatoprevioCar">
+    <w:name w:val="HTML con formato previo Car"/>
+    <w:basedOn w:val="Fuentedeprrafopredeter"/>
+    <w:link w:val="HTMLconformatoprevio"/>
+    <w:uiPriority w:val="99"/>
+    <w:semiHidden/>
+    <w:rsid w:val="006E7632"/>
+    <w:rPr>
+      <w:rFonts w:ascii="Courier New" w:eastAsia="Times New Roman" w:hAnsi="Courier New" w:cs="Courier New"/>
+      <w:sz w:val="20"/>
+      <w:szCs w:val="20"/>
+      <w:lang w:eastAsia="es-PE"/>
+    </w:rPr>
+  </w:style>
+  <w:style w:type="character" w:customStyle="1" w:styleId="pl-c">
+    <w:name w:val="pl-c"/>
+    <w:basedOn w:val="Fuentedeprrafopredeter"/>
+    <w:rsid w:val="006E7632"/>
+  </w:style>
 </w:styles>
 </file>
 

</xml_diff>

<commit_message>
upload load model in google colab
</commit_message>
<xml_diff>
--- a/PruebasEntornoLocal.docx
+++ b/PruebasEntornoLocal.docx
@@ -133,6 +133,10 @@
     </w:p>
     <w:p>
       <w:r>
+        <w:rPr>
+          <w:noProof/>
+          <w:lang w:eastAsia="es-PE"/>
+        </w:rPr>
         <w:drawing>
           <wp:inline distT="0" distB="0" distL="0" distR="0" wp14:anchorId="3CEEB5C2" wp14:editId="510D9A7C">
             <wp:extent cx="5400040" cy="1478280"/>
@@ -196,6 +200,10 @@
     </w:p>
     <w:p>
       <w:r>
+        <w:rPr>
+          <w:noProof/>
+          <w:lang w:eastAsia="es-PE"/>
+        </w:rPr>
         <w:drawing>
           <wp:inline distT="0" distB="0" distL="0" distR="0" wp14:anchorId="5B149496" wp14:editId="16DE2635">
             <wp:extent cx="5400040" cy="2594610"/>
@@ -247,9 +255,11 @@
       <w:proofErr w:type="spellEnd"/>
     </w:p>
     <w:p>
-      <w:bookmarkStart w:id="0" w:name="_GoBack"/>
-      <w:bookmarkEnd w:id="0"/>
-      <w:r>
+      <w:r>
+        <w:rPr>
+          <w:noProof/>
+          <w:lang w:eastAsia="es-PE"/>
+        </w:rPr>
         <w:drawing>
           <wp:inline distT="0" distB="0" distL="0" distR="0" wp14:anchorId="7F4E6BFA" wp14:editId="1DB08870">
             <wp:extent cx="5400040" cy="2349500"/>
@@ -286,6 +296,422 @@
           </wp:inline>
         </w:drawing>
       </w:r>
+    </w:p>
+    <w:p>
+      <w:r>
+        <w:t>6</w:t>
+      </w:r>
+      <w:r>
+        <w:t xml:space="preserve">. </w:t>
+      </w:r>
+      <w:r>
+        <w:t xml:space="preserve">Entrenamiento de Modelo en google </w:t>
+      </w:r>
+      <w:proofErr w:type="spellStart"/>
+      <w:r>
+        <w:t>colab</w:t>
+      </w:r>
+      <w:proofErr w:type="spellEnd"/>
+      <w:r>
+        <w:t>:</w:t>
+      </w:r>
+    </w:p>
+    <w:p>
+      <w:r>
+        <w:lastRenderedPageBreak/>
+        <w:drawing>
+          <wp:inline distT="0" distB="0" distL="0" distR="0" wp14:anchorId="7F94583B" wp14:editId="5141A77D">
+            <wp:extent cx="5400040" cy="3903980"/>
+            <wp:effectExtent l="0" t="0" r="0" b="1270"/>
+            <wp:docPr id="6" name="Imagen 6"/>
+            <wp:cNvGraphicFramePr>
+              <a:graphicFrameLocks xmlns:a="http://schemas.openxmlformats.org/drawingml/2006/main" noChangeAspect="1"/>
+            </wp:cNvGraphicFramePr>
+            <a:graphic xmlns:a="http://schemas.openxmlformats.org/drawingml/2006/main">
+              <a:graphicData uri="http://schemas.openxmlformats.org/drawingml/2006/picture">
+                <pic:pic xmlns:pic="http://schemas.openxmlformats.org/drawingml/2006/picture">
+                  <pic:nvPicPr>
+                    <pic:cNvPr id="1" name=""/>
+                    <pic:cNvPicPr/>
+                  </pic:nvPicPr>
+                  <pic:blipFill>
+                    <a:blip r:embed="rId10"/>
+                    <a:stretch>
+                      <a:fillRect/>
+                    </a:stretch>
+                  </pic:blipFill>
+                  <pic:spPr>
+                    <a:xfrm>
+                      <a:off x="0" y="0"/>
+                      <a:ext cx="5400040" cy="3903980"/>
+                    </a:xfrm>
+                    <a:prstGeom prst="rect">
+                      <a:avLst/>
+                    </a:prstGeom>
+                  </pic:spPr>
+                </pic:pic>
+              </a:graphicData>
+            </a:graphic>
+          </wp:inline>
+        </w:drawing>
+      </w:r>
+      <w:r>
+        <w:lastRenderedPageBreak/>
+        <w:drawing>
+          <wp:inline distT="0" distB="0" distL="0" distR="0" wp14:anchorId="21930361" wp14:editId="284BBFA0">
+            <wp:extent cx="5400040" cy="5665470"/>
+            <wp:effectExtent l="0" t="0" r="0" b="0"/>
+            <wp:docPr id="7" name="Imagen 7"/>
+            <wp:cNvGraphicFramePr>
+              <a:graphicFrameLocks xmlns:a="http://schemas.openxmlformats.org/drawingml/2006/main" noChangeAspect="1"/>
+            </wp:cNvGraphicFramePr>
+            <a:graphic xmlns:a="http://schemas.openxmlformats.org/drawingml/2006/main">
+              <a:graphicData uri="http://schemas.openxmlformats.org/drawingml/2006/picture">
+                <pic:pic xmlns:pic="http://schemas.openxmlformats.org/drawingml/2006/picture">
+                  <pic:nvPicPr>
+                    <pic:cNvPr id="1" name=""/>
+                    <pic:cNvPicPr/>
+                  </pic:nvPicPr>
+                  <pic:blipFill>
+                    <a:blip r:embed="rId11"/>
+                    <a:stretch>
+                      <a:fillRect/>
+                    </a:stretch>
+                  </pic:blipFill>
+                  <pic:spPr>
+                    <a:xfrm>
+                      <a:off x="0" y="0"/>
+                      <a:ext cx="5400040" cy="5665470"/>
+                    </a:xfrm>
+                    <a:prstGeom prst="rect">
+                      <a:avLst/>
+                    </a:prstGeom>
+                  </pic:spPr>
+                </pic:pic>
+              </a:graphicData>
+            </a:graphic>
+          </wp:inline>
+        </w:drawing>
+      </w:r>
+      <w:r>
+        <w:drawing>
+          <wp:inline distT="0" distB="0" distL="0" distR="0" wp14:anchorId="04FDD483" wp14:editId="7B7734C8">
+            <wp:extent cx="5400040" cy="1557020"/>
+            <wp:effectExtent l="0" t="0" r="0" b="5080"/>
+            <wp:docPr id="8" name="Imagen 8"/>
+            <wp:cNvGraphicFramePr>
+              <a:graphicFrameLocks xmlns:a="http://schemas.openxmlformats.org/drawingml/2006/main" noChangeAspect="1"/>
+            </wp:cNvGraphicFramePr>
+            <a:graphic xmlns:a="http://schemas.openxmlformats.org/drawingml/2006/main">
+              <a:graphicData uri="http://schemas.openxmlformats.org/drawingml/2006/picture">
+                <pic:pic xmlns:pic="http://schemas.openxmlformats.org/drawingml/2006/picture">
+                  <pic:nvPicPr>
+                    <pic:cNvPr id="1" name=""/>
+                    <pic:cNvPicPr/>
+                  </pic:nvPicPr>
+                  <pic:blipFill>
+                    <a:blip r:embed="rId12"/>
+                    <a:stretch>
+                      <a:fillRect/>
+                    </a:stretch>
+                  </pic:blipFill>
+                  <pic:spPr>
+                    <a:xfrm>
+                      <a:off x="0" y="0"/>
+                      <a:ext cx="5400040" cy="1557020"/>
+                    </a:xfrm>
+                    <a:prstGeom prst="rect">
+                      <a:avLst/>
+                    </a:prstGeom>
+                  </pic:spPr>
+                </pic:pic>
+              </a:graphicData>
+            </a:graphic>
+          </wp:inline>
+        </w:drawing>
+      </w:r>
+      <w:r>
+        <w:lastRenderedPageBreak/>
+        <w:drawing>
+          <wp:inline distT="0" distB="0" distL="0" distR="0" wp14:anchorId="4090641F" wp14:editId="0EC90F18">
+            <wp:extent cx="5400040" cy="2600325"/>
+            <wp:effectExtent l="0" t="0" r="0" b="9525"/>
+            <wp:docPr id="9" name="Imagen 9"/>
+            <wp:cNvGraphicFramePr>
+              <a:graphicFrameLocks xmlns:a="http://schemas.openxmlformats.org/drawingml/2006/main" noChangeAspect="1"/>
+            </wp:cNvGraphicFramePr>
+            <a:graphic xmlns:a="http://schemas.openxmlformats.org/drawingml/2006/main">
+              <a:graphicData uri="http://schemas.openxmlformats.org/drawingml/2006/picture">
+                <pic:pic xmlns:pic="http://schemas.openxmlformats.org/drawingml/2006/picture">
+                  <pic:nvPicPr>
+                    <pic:cNvPr id="1" name=""/>
+                    <pic:cNvPicPr/>
+                  </pic:nvPicPr>
+                  <pic:blipFill>
+                    <a:blip r:embed="rId13"/>
+                    <a:stretch>
+                      <a:fillRect/>
+                    </a:stretch>
+                  </pic:blipFill>
+                  <pic:spPr>
+                    <a:xfrm>
+                      <a:off x="0" y="0"/>
+                      <a:ext cx="5400040" cy="2600325"/>
+                    </a:xfrm>
+                    <a:prstGeom prst="rect">
+                      <a:avLst/>
+                    </a:prstGeom>
+                  </pic:spPr>
+                </pic:pic>
+              </a:graphicData>
+            </a:graphic>
+          </wp:inline>
+        </w:drawing>
+      </w:r>
+      <w:r>
+        <w:drawing>
+          <wp:inline distT="0" distB="0" distL="0" distR="0" wp14:anchorId="3BE7C022" wp14:editId="6CFB5E39">
+            <wp:extent cx="5400040" cy="2411095"/>
+            <wp:effectExtent l="0" t="0" r="0" b="8255"/>
+            <wp:docPr id="10" name="Imagen 10"/>
+            <wp:cNvGraphicFramePr>
+              <a:graphicFrameLocks xmlns:a="http://schemas.openxmlformats.org/drawingml/2006/main" noChangeAspect="1"/>
+            </wp:cNvGraphicFramePr>
+            <a:graphic xmlns:a="http://schemas.openxmlformats.org/drawingml/2006/main">
+              <a:graphicData uri="http://schemas.openxmlformats.org/drawingml/2006/picture">
+                <pic:pic xmlns:pic="http://schemas.openxmlformats.org/drawingml/2006/picture">
+                  <pic:nvPicPr>
+                    <pic:cNvPr id="1" name=""/>
+                    <pic:cNvPicPr/>
+                  </pic:nvPicPr>
+                  <pic:blipFill>
+                    <a:blip r:embed="rId14"/>
+                    <a:stretch>
+                      <a:fillRect/>
+                    </a:stretch>
+                  </pic:blipFill>
+                  <pic:spPr>
+                    <a:xfrm>
+                      <a:off x="0" y="0"/>
+                      <a:ext cx="5400040" cy="2411095"/>
+                    </a:xfrm>
+                    <a:prstGeom prst="rect">
+                      <a:avLst/>
+                    </a:prstGeom>
+                  </pic:spPr>
+                </pic:pic>
+              </a:graphicData>
+            </a:graphic>
+          </wp:inline>
+        </w:drawing>
+      </w:r>
+      <w:r>
+        <w:drawing>
+          <wp:inline distT="0" distB="0" distL="0" distR="0" wp14:anchorId="7E2DAADD" wp14:editId="6A9BF761">
+            <wp:extent cx="5400040" cy="1762125"/>
+            <wp:effectExtent l="0" t="0" r="0" b="9525"/>
+            <wp:docPr id="11" name="Imagen 11"/>
+            <wp:cNvGraphicFramePr>
+              <a:graphicFrameLocks xmlns:a="http://schemas.openxmlformats.org/drawingml/2006/main" noChangeAspect="1"/>
+            </wp:cNvGraphicFramePr>
+            <a:graphic xmlns:a="http://schemas.openxmlformats.org/drawingml/2006/main">
+              <a:graphicData uri="http://schemas.openxmlformats.org/drawingml/2006/picture">
+                <pic:pic xmlns:pic="http://schemas.openxmlformats.org/drawingml/2006/picture">
+                  <pic:nvPicPr>
+                    <pic:cNvPr id="1" name=""/>
+                    <pic:cNvPicPr/>
+                  </pic:nvPicPr>
+                  <pic:blipFill>
+                    <a:blip r:embed="rId15"/>
+                    <a:stretch>
+                      <a:fillRect/>
+                    </a:stretch>
+                  </pic:blipFill>
+                  <pic:spPr>
+                    <a:xfrm>
+                      <a:off x="0" y="0"/>
+                      <a:ext cx="5400040" cy="1762125"/>
+                    </a:xfrm>
+                    <a:prstGeom prst="rect">
+                      <a:avLst/>
+                    </a:prstGeom>
+                  </pic:spPr>
+                </pic:pic>
+              </a:graphicData>
+            </a:graphic>
+          </wp:inline>
+        </w:drawing>
+      </w:r>
+    </w:p>
+    <w:p>
+      <w:r>
+        <w:lastRenderedPageBreak/>
+        <w:drawing>
+          <wp:inline distT="0" distB="0" distL="0" distR="0" wp14:anchorId="2656CAA8" wp14:editId="53A2936C">
+            <wp:extent cx="5400040" cy="869950"/>
+            <wp:effectExtent l="0" t="0" r="0" b="6350"/>
+            <wp:docPr id="12" name="Imagen 12"/>
+            <wp:cNvGraphicFramePr>
+              <a:graphicFrameLocks xmlns:a="http://schemas.openxmlformats.org/drawingml/2006/main" noChangeAspect="1"/>
+            </wp:cNvGraphicFramePr>
+            <a:graphic xmlns:a="http://schemas.openxmlformats.org/drawingml/2006/main">
+              <a:graphicData uri="http://schemas.openxmlformats.org/drawingml/2006/picture">
+                <pic:pic xmlns:pic="http://schemas.openxmlformats.org/drawingml/2006/picture">
+                  <pic:nvPicPr>
+                    <pic:cNvPr id="1" name=""/>
+                    <pic:cNvPicPr/>
+                  </pic:nvPicPr>
+                  <pic:blipFill>
+                    <a:blip r:embed="rId16"/>
+                    <a:stretch>
+                      <a:fillRect/>
+                    </a:stretch>
+                  </pic:blipFill>
+                  <pic:spPr>
+                    <a:xfrm>
+                      <a:off x="0" y="0"/>
+                      <a:ext cx="5400040" cy="869950"/>
+                    </a:xfrm>
+                    <a:prstGeom prst="rect">
+                      <a:avLst/>
+                    </a:prstGeom>
+                  </pic:spPr>
+                </pic:pic>
+              </a:graphicData>
+            </a:graphic>
+          </wp:inline>
+        </w:drawing>
+      </w:r>
+      <w:r>
+        <w:drawing>
+          <wp:inline distT="0" distB="0" distL="0" distR="0" wp14:anchorId="3023B750" wp14:editId="3F4EE55F">
+            <wp:extent cx="5400040" cy="2677795"/>
+            <wp:effectExtent l="0" t="0" r="0" b="8255"/>
+            <wp:docPr id="14" name="Imagen 14"/>
+            <wp:cNvGraphicFramePr>
+              <a:graphicFrameLocks xmlns:a="http://schemas.openxmlformats.org/drawingml/2006/main" noChangeAspect="1"/>
+            </wp:cNvGraphicFramePr>
+            <a:graphic xmlns:a="http://schemas.openxmlformats.org/drawingml/2006/main">
+              <a:graphicData uri="http://schemas.openxmlformats.org/drawingml/2006/picture">
+                <pic:pic xmlns:pic="http://schemas.openxmlformats.org/drawingml/2006/picture">
+                  <pic:nvPicPr>
+                    <pic:cNvPr id="1" name=""/>
+                    <pic:cNvPicPr/>
+                  </pic:nvPicPr>
+                  <pic:blipFill>
+                    <a:blip r:embed="rId17"/>
+                    <a:stretch>
+                      <a:fillRect/>
+                    </a:stretch>
+                  </pic:blipFill>
+                  <pic:spPr>
+                    <a:xfrm>
+                      <a:off x="0" y="0"/>
+                      <a:ext cx="5400040" cy="2677795"/>
+                    </a:xfrm>
+                    <a:prstGeom prst="rect">
+                      <a:avLst/>
+                    </a:prstGeom>
+                  </pic:spPr>
+                </pic:pic>
+              </a:graphicData>
+            </a:graphic>
+          </wp:inline>
+        </w:drawing>
+      </w:r>
+    </w:p>
+    <w:p>
+      <w:r>
+        <w:t>Entrenamiento de modelos:</w:t>
+      </w:r>
+    </w:p>
+    <w:p>
+      <w:r>
+        <w:drawing>
+          <wp:inline distT="0" distB="0" distL="0" distR="0" wp14:anchorId="0C632EE4" wp14:editId="43D3AB5F">
+            <wp:extent cx="5400040" cy="2713990"/>
+            <wp:effectExtent l="0" t="0" r="0" b="0"/>
+            <wp:docPr id="16" name="Imagen 16"/>
+            <wp:cNvGraphicFramePr>
+              <a:graphicFrameLocks xmlns:a="http://schemas.openxmlformats.org/drawingml/2006/main" noChangeAspect="1"/>
+            </wp:cNvGraphicFramePr>
+            <a:graphic xmlns:a="http://schemas.openxmlformats.org/drawingml/2006/main">
+              <a:graphicData uri="http://schemas.openxmlformats.org/drawingml/2006/picture">
+                <pic:pic xmlns:pic="http://schemas.openxmlformats.org/drawingml/2006/picture">
+                  <pic:nvPicPr>
+                    <pic:cNvPr id="1" name=""/>
+                    <pic:cNvPicPr/>
+                  </pic:nvPicPr>
+                  <pic:blipFill>
+                    <a:blip r:embed="rId18"/>
+                    <a:stretch>
+                      <a:fillRect/>
+                    </a:stretch>
+                  </pic:blipFill>
+                  <pic:spPr>
+                    <a:xfrm>
+                      <a:off x="0" y="0"/>
+                      <a:ext cx="5400040" cy="2713990"/>
+                    </a:xfrm>
+                    <a:prstGeom prst="rect">
+                      <a:avLst/>
+                    </a:prstGeom>
+                  </pic:spPr>
+                </pic:pic>
+              </a:graphicData>
+            </a:graphic>
+          </wp:inline>
+        </w:drawing>
+      </w:r>
+    </w:p>
+    <w:p>
+      <w:r>
+        <w:t>Guardar modelo y curva de perdida</w:t>
+      </w:r>
+    </w:p>
+    <w:p>
+      <w:r>
+        <w:lastRenderedPageBreak/>
+        <w:drawing>
+          <wp:inline distT="0" distB="0" distL="0" distR="0" wp14:anchorId="53F9A94E" wp14:editId="7C389601">
+            <wp:extent cx="5400040" cy="1874520"/>
+            <wp:effectExtent l="0" t="0" r="0" b="0"/>
+            <wp:docPr id="17" name="Imagen 17"/>
+            <wp:cNvGraphicFramePr>
+              <a:graphicFrameLocks xmlns:a="http://schemas.openxmlformats.org/drawingml/2006/main" noChangeAspect="1"/>
+            </wp:cNvGraphicFramePr>
+            <a:graphic xmlns:a="http://schemas.openxmlformats.org/drawingml/2006/main">
+              <a:graphicData uri="http://schemas.openxmlformats.org/drawingml/2006/picture">
+                <pic:pic xmlns:pic="http://schemas.openxmlformats.org/drawingml/2006/picture">
+                  <pic:nvPicPr>
+                    <pic:cNvPr id="1" name=""/>
+                    <pic:cNvPicPr/>
+                  </pic:nvPicPr>
+                  <pic:blipFill>
+                    <a:blip r:embed="rId19"/>
+                    <a:stretch>
+                      <a:fillRect/>
+                    </a:stretch>
+                  </pic:blipFill>
+                  <pic:spPr>
+                    <a:xfrm>
+                      <a:off x="0" y="0"/>
+                      <a:ext cx="5400040" cy="1874520"/>
+                    </a:xfrm>
+                    <a:prstGeom prst="rect">
+                      <a:avLst/>
+                    </a:prstGeom>
+                  </pic:spPr>
+                </pic:pic>
+              </a:graphicData>
+            </a:graphic>
+          </wp:inline>
+        </w:drawing>
+      </w:r>
+    </w:p>
+    <w:p>
+      <w:bookmarkStart w:id="0" w:name="_GoBack"/>
+      <w:bookmarkEnd w:id="0"/>
     </w:p>
     <w:sectPr>
       <w:pgSz w:w="11906" w:h="16838"/>

</xml_diff>

<commit_message>
upload result training model QLora4
</commit_message>
<xml_diff>
--- a/PruebasEntornoLocal.docx
+++ b/PruebasEntornoLocal.docx
@@ -710,6 +710,111 @@
       </w:r>
     </w:p>
     <w:p>
+      <w:r>
+        <w:t>Inferencias de Modelo:</w:t>
+      </w:r>
+    </w:p>
+    <w:p>
+      <w:r>
+        <w:drawing>
+          <wp:inline distT="0" distB="0" distL="0" distR="0" wp14:anchorId="13CC51EF" wp14:editId="7BAA7274">
+            <wp:extent cx="5400040" cy="2475865"/>
+            <wp:effectExtent l="0" t="0" r="0" b="635"/>
+            <wp:docPr id="18" name="Imagen 18"/>
+            <wp:cNvGraphicFramePr>
+              <a:graphicFrameLocks xmlns:a="http://schemas.openxmlformats.org/drawingml/2006/main" noChangeAspect="1"/>
+            </wp:cNvGraphicFramePr>
+            <a:graphic xmlns:a="http://schemas.openxmlformats.org/drawingml/2006/main">
+              <a:graphicData uri="http://schemas.openxmlformats.org/drawingml/2006/picture">
+                <pic:pic xmlns:pic="http://schemas.openxmlformats.org/drawingml/2006/picture">
+                  <pic:nvPicPr>
+                    <pic:cNvPr id="1" name=""/>
+                    <pic:cNvPicPr/>
+                  </pic:nvPicPr>
+                  <pic:blipFill>
+                    <a:blip r:embed="rId20"/>
+                    <a:stretch>
+                      <a:fillRect/>
+                    </a:stretch>
+                  </pic:blipFill>
+                  <pic:spPr>
+                    <a:xfrm>
+                      <a:off x="0" y="0"/>
+                      <a:ext cx="5400040" cy="2475865"/>
+                    </a:xfrm>
+                    <a:prstGeom prst="rect">
+                      <a:avLst/>
+                    </a:prstGeom>
+                  </pic:spPr>
+                </pic:pic>
+              </a:graphicData>
+            </a:graphic>
+          </wp:inline>
+        </w:drawing>
+      </w:r>
+    </w:p>
+    <w:p>
+      <w:pPr>
+        <w:shd w:val="clear" w:color="auto" w:fill="FFFFFF"/>
+        <w:spacing w:before="120" w:after="120" w:line="240" w:lineRule="auto"/>
+        <w:outlineLvl w:val="1"/>
+        <w:rPr>
+          <w:rFonts w:ascii="Arial" w:eastAsia="Times New Roman" w:hAnsi="Arial" w:cs="Arial"/>
+          <w:color w:val="1F1F1F"/>
+          <w:sz w:val="35"/>
+          <w:szCs w:val="35"/>
+          <w:lang w:eastAsia="es-PE"/>
+        </w:rPr>
+      </w:pPr>
+      <w:r>
+        <w:rPr>
+          <w:rFonts w:ascii="Arial" w:eastAsia="Times New Roman" w:hAnsi="Arial" w:cs="Arial"/>
+          <w:color w:val="1F1F1F"/>
+          <w:sz w:val="35"/>
+          <w:szCs w:val="35"/>
+          <w:lang w:eastAsia="es-PE"/>
+        </w:rPr>
+        <w:t>Celda 9 — Evaluación con métricas ROUGE y BLEU</w:t>
+      </w:r>
+    </w:p>
+    <w:p>
+      <w:r>
+        <w:drawing>
+          <wp:inline distT="0" distB="0" distL="0" distR="0" wp14:anchorId="62F36E19" wp14:editId="4E223B5A">
+            <wp:extent cx="5400040" cy="3210560"/>
+            <wp:effectExtent l="0" t="0" r="0" b="8890"/>
+            <wp:docPr id="19" name="Imagen 19"/>
+            <wp:cNvGraphicFramePr>
+              <a:graphicFrameLocks xmlns:a="http://schemas.openxmlformats.org/drawingml/2006/main" noChangeAspect="1"/>
+            </wp:cNvGraphicFramePr>
+            <a:graphic xmlns:a="http://schemas.openxmlformats.org/drawingml/2006/main">
+              <a:graphicData uri="http://schemas.openxmlformats.org/drawingml/2006/picture">
+                <pic:pic xmlns:pic="http://schemas.openxmlformats.org/drawingml/2006/picture">
+                  <pic:nvPicPr>
+                    <pic:cNvPr id="1" name=""/>
+                    <pic:cNvPicPr/>
+                  </pic:nvPicPr>
+                  <pic:blipFill>
+                    <a:blip r:embed="rId21"/>
+                    <a:stretch>
+                      <a:fillRect/>
+                    </a:stretch>
+                  </pic:blipFill>
+                  <pic:spPr>
+                    <a:xfrm>
+                      <a:off x="0" y="0"/>
+                      <a:ext cx="5400040" cy="3210560"/>
+                    </a:xfrm>
+                    <a:prstGeom prst="rect">
+                      <a:avLst/>
+                    </a:prstGeom>
+                  </pic:spPr>
+                </pic:pic>
+              </a:graphicData>
+            </a:graphic>
+          </wp:inline>
+        </w:drawing>
+      </w:r>
       <w:bookmarkStart w:id="0" w:name="_GoBack"/>
       <w:bookmarkEnd w:id="0"/>
     </w:p>
@@ -1214,6 +1319,26 @@
     <w:name w:val="Normal"/>
     <w:qFormat/>
   </w:style>
+  <w:style w:type="paragraph" w:styleId="Ttulo2">
+    <w:name w:val="heading 2"/>
+    <w:basedOn w:val="Normal"/>
+    <w:link w:val="Ttulo2Car"/>
+    <w:uiPriority w:val="9"/>
+    <w:qFormat/>
+    <w:rsid w:val="00A028B0"/>
+    <w:pPr>
+      <w:spacing w:before="100" w:beforeAutospacing="1" w:after="100" w:afterAutospacing="1" w:line="240" w:lineRule="auto"/>
+      <w:outlineLvl w:val="1"/>
+    </w:pPr>
+    <w:rPr>
+      <w:rFonts w:ascii="Times New Roman" w:eastAsia="Times New Roman" w:hAnsi="Times New Roman" w:cs="Times New Roman"/>
+      <w:b/>
+      <w:bCs/>
+      <w:sz w:val="36"/>
+      <w:szCs w:val="36"/>
+      <w:lang w:eastAsia="es-PE"/>
+    </w:rPr>
+  </w:style>
   <w:style w:type="character" w:default="1" w:styleId="Fuentedeprrafopredeter">
     <w:name w:val="Default Paragraph Font"/>
     <w:uiPriority w:val="1"/>
@@ -1306,6 +1431,21 @@
     <w:name w:val="pl-c"/>
     <w:basedOn w:val="Fuentedeprrafopredeter"/>
     <w:rsid w:val="006E7632"/>
+  </w:style>
+  <w:style w:type="character" w:customStyle="1" w:styleId="Ttulo2Car">
+    <w:name w:val="Título 2 Car"/>
+    <w:basedOn w:val="Fuentedeprrafopredeter"/>
+    <w:link w:val="Ttulo2"/>
+    <w:uiPriority w:val="9"/>
+    <w:rsid w:val="00A028B0"/>
+    <w:rPr>
+      <w:rFonts w:ascii="Times New Roman" w:eastAsia="Times New Roman" w:hAnsi="Times New Roman" w:cs="Times New Roman"/>
+      <w:b/>
+      <w:bCs/>
+      <w:sz w:val="36"/>
+      <w:szCs w:val="36"/>
+      <w:lang w:eastAsia="es-PE"/>
+    </w:rPr>
   </w:style>
 </w:styles>
 </file>

</xml_diff>

<commit_message>
se agregar documentos pdf para el procesamiento
</commit_message>
<xml_diff>
--- a/PruebasEntornoLocal.docx
+++ b/PruebasEntornoLocal.docx
@@ -299,13 +299,7 @@
     </w:p>
     <w:p>
       <w:r>
-        <w:t>6</w:t>
-      </w:r>
-      <w:r>
-        <w:t xml:space="preserve">. </w:t>
-      </w:r>
-      <w:r>
-        <w:t xml:space="preserve">Entrenamiento de Modelo en google </w:t>
+        <w:t xml:space="preserve">6. Entrenamiento de Modelo en google </w:t>
       </w:r>
       <w:proofErr w:type="spellStart"/>
       <w:r>
@@ -318,6 +312,10 @@
     </w:p>
     <w:p>
       <w:r>
+        <w:rPr>
+          <w:noProof/>
+          <w:lang w:eastAsia="es-PE"/>
+        </w:rPr>
         <w:lastRenderedPageBreak/>
         <w:drawing>
           <wp:inline distT="0" distB="0" distL="0" distR="0" wp14:anchorId="7F94583B" wp14:editId="5141A77D">
@@ -356,6 +354,10 @@
         </w:drawing>
       </w:r>
       <w:r>
+        <w:rPr>
+          <w:noProof/>
+          <w:lang w:eastAsia="es-PE"/>
+        </w:rPr>
         <w:lastRenderedPageBreak/>
         <w:drawing>
           <wp:inline distT="0" distB="0" distL="0" distR="0" wp14:anchorId="21930361" wp14:editId="284BBFA0">
@@ -394,6 +396,10 @@
         </w:drawing>
       </w:r>
       <w:r>
+        <w:rPr>
+          <w:noProof/>
+          <w:lang w:eastAsia="es-PE"/>
+        </w:rPr>
         <w:drawing>
           <wp:inline distT="0" distB="0" distL="0" distR="0" wp14:anchorId="04FDD483" wp14:editId="7B7734C8">
             <wp:extent cx="5400040" cy="1557020"/>
@@ -431,6 +437,10 @@
         </w:drawing>
       </w:r>
       <w:r>
+        <w:rPr>
+          <w:noProof/>
+          <w:lang w:eastAsia="es-PE"/>
+        </w:rPr>
         <w:lastRenderedPageBreak/>
         <w:drawing>
           <wp:inline distT="0" distB="0" distL="0" distR="0" wp14:anchorId="4090641F" wp14:editId="0EC90F18">
@@ -469,6 +479,10 @@
         </w:drawing>
       </w:r>
       <w:r>
+        <w:rPr>
+          <w:noProof/>
+          <w:lang w:eastAsia="es-PE"/>
+        </w:rPr>
         <w:drawing>
           <wp:inline distT="0" distB="0" distL="0" distR="0" wp14:anchorId="3BE7C022" wp14:editId="6CFB5E39">
             <wp:extent cx="5400040" cy="2411095"/>
@@ -506,6 +520,10 @@
         </w:drawing>
       </w:r>
       <w:r>
+        <w:rPr>
+          <w:noProof/>
+          <w:lang w:eastAsia="es-PE"/>
+        </w:rPr>
         <w:drawing>
           <wp:inline distT="0" distB="0" distL="0" distR="0" wp14:anchorId="7E2DAADD" wp14:editId="6A9BF761">
             <wp:extent cx="5400040" cy="1762125"/>
@@ -545,6 +563,10 @@
     </w:p>
     <w:p>
       <w:r>
+        <w:rPr>
+          <w:noProof/>
+          <w:lang w:eastAsia="es-PE"/>
+        </w:rPr>
         <w:lastRenderedPageBreak/>
         <w:drawing>
           <wp:inline distT="0" distB="0" distL="0" distR="0" wp14:anchorId="2656CAA8" wp14:editId="53A2936C">
@@ -583,6 +605,10 @@
         </w:drawing>
       </w:r>
       <w:r>
+        <w:rPr>
+          <w:noProof/>
+          <w:lang w:eastAsia="es-PE"/>
+        </w:rPr>
         <w:drawing>
           <wp:inline distT="0" distB="0" distL="0" distR="0" wp14:anchorId="3023B750" wp14:editId="3F4EE55F">
             <wp:extent cx="5400040" cy="2677795"/>
@@ -622,16 +648,21 @@
     </w:p>
     <w:p>
       <w:r>
-        <w:t>Entrenamiento de modelos:</w:t>
-      </w:r>
+        <w:t xml:space="preserve">**** con 12 </w:t>
+      </w:r>
+      <w:proofErr w:type="spellStart"/>
+      <w:r>
+        <w:t>pdfs</w:t>
+      </w:r>
+      <w:proofErr w:type="spellEnd"/>
     </w:p>
     <w:p>
       <w:r>
         <w:drawing>
-          <wp:inline distT="0" distB="0" distL="0" distR="0" wp14:anchorId="0C632EE4" wp14:editId="43D3AB5F">
-            <wp:extent cx="5400040" cy="2713990"/>
+          <wp:inline distT="0" distB="0" distL="0" distR="0" wp14:anchorId="600A9CE6" wp14:editId="57121476">
+            <wp:extent cx="5400040" cy="2708910"/>
             <wp:effectExtent l="0" t="0" r="0" b="0"/>
-            <wp:docPr id="16" name="Imagen 16"/>
+            <wp:docPr id="13" name="Imagen 13"/>
             <wp:cNvGraphicFramePr>
               <a:graphicFrameLocks xmlns:a="http://schemas.openxmlformats.org/drawingml/2006/main" noChangeAspect="1"/>
             </wp:cNvGraphicFramePr>
@@ -651,7 +682,7 @@
                   <pic:spPr>
                     <a:xfrm>
                       <a:off x="0" y="0"/>
-                      <a:ext cx="5400040" cy="2713990"/>
+                      <a:ext cx="5400040" cy="2708910"/>
                     </a:xfrm>
                     <a:prstGeom prst="rect">
                       <a:avLst/>
@@ -663,20 +694,26 @@
           </wp:inline>
         </w:drawing>
       </w:r>
-    </w:p>
-    <w:p>
-      <w:r>
-        <w:t>Guardar modelo y curva de perdida</w:t>
-      </w:r>
-    </w:p>
-    <w:p>
-      <w:r>
+      <w:bookmarkStart w:id="0" w:name="_GoBack"/>
+      <w:bookmarkEnd w:id="0"/>
+    </w:p>
+    <w:p>
+      <w:r>
+        <w:t>Entrenamiento de modelos:</w:t>
+      </w:r>
+    </w:p>
+    <w:p>
+      <w:r>
+        <w:rPr>
+          <w:noProof/>
+          <w:lang w:eastAsia="es-PE"/>
+        </w:rPr>
         <w:lastRenderedPageBreak/>
         <w:drawing>
-          <wp:inline distT="0" distB="0" distL="0" distR="0" wp14:anchorId="53F9A94E" wp14:editId="7C389601">
-            <wp:extent cx="5400040" cy="1874520"/>
+          <wp:inline distT="0" distB="0" distL="0" distR="0" wp14:anchorId="0C632EE4" wp14:editId="43D3AB5F">
+            <wp:extent cx="5400040" cy="2713990"/>
             <wp:effectExtent l="0" t="0" r="0" b="0"/>
-            <wp:docPr id="17" name="Imagen 17"/>
+            <wp:docPr id="16" name="Imagen 16"/>
             <wp:cNvGraphicFramePr>
               <a:graphicFrameLocks xmlns:a="http://schemas.openxmlformats.org/drawingml/2006/main" noChangeAspect="1"/>
             </wp:cNvGraphicFramePr>
@@ -696,7 +733,7 @@
                   <pic:spPr>
                     <a:xfrm>
                       <a:off x="0" y="0"/>
-                      <a:ext cx="5400040" cy="1874520"/>
+                      <a:ext cx="5400040" cy="2713990"/>
                     </a:xfrm>
                     <a:prstGeom prst="rect">
                       <a:avLst/>
@@ -711,16 +748,20 @@
     </w:p>
     <w:p>
       <w:r>
-        <w:t>Inferencias de Modelo:</w:t>
-      </w:r>
-    </w:p>
-    <w:p>
-      <w:r>
+        <w:t>Guardar modelo y curva de perdida</w:t>
+      </w:r>
+    </w:p>
+    <w:p>
+      <w:r>
+        <w:rPr>
+          <w:noProof/>
+          <w:lang w:eastAsia="es-PE"/>
+        </w:rPr>
         <w:drawing>
-          <wp:inline distT="0" distB="0" distL="0" distR="0" wp14:anchorId="13CC51EF" wp14:editId="7BAA7274">
-            <wp:extent cx="5400040" cy="2475865"/>
-            <wp:effectExtent l="0" t="0" r="0" b="635"/>
-            <wp:docPr id="18" name="Imagen 18"/>
+          <wp:inline distT="0" distB="0" distL="0" distR="0" wp14:anchorId="53F9A94E" wp14:editId="7C389601">
+            <wp:extent cx="5400040" cy="1874520"/>
+            <wp:effectExtent l="0" t="0" r="0" b="0"/>
+            <wp:docPr id="17" name="Imagen 17"/>
             <wp:cNvGraphicFramePr>
               <a:graphicFrameLocks xmlns:a="http://schemas.openxmlformats.org/drawingml/2006/main" noChangeAspect="1"/>
             </wp:cNvGraphicFramePr>
@@ -740,7 +781,7 @@
                   <pic:spPr>
                     <a:xfrm>
                       <a:off x="0" y="0"/>
-                      <a:ext cx="5400040" cy="2475865"/>
+                      <a:ext cx="5400040" cy="1874520"/>
                     </a:xfrm>
                     <a:prstGeom prst="rect">
                       <a:avLst/>
@@ -754,36 +795,21 @@
       </w:r>
     </w:p>
     <w:p>
-      <w:pPr>
-        <w:shd w:val="clear" w:color="auto" w:fill="FFFFFF"/>
-        <w:spacing w:before="120" w:after="120" w:line="240" w:lineRule="auto"/>
-        <w:outlineLvl w:val="1"/>
+      <w:r>
+        <w:t>Inferencias de Modelo:</w:t>
+      </w:r>
+    </w:p>
+    <w:p>
+      <w:r>
         <w:rPr>
-          <w:rFonts w:ascii="Arial" w:eastAsia="Times New Roman" w:hAnsi="Arial" w:cs="Arial"/>
-          <w:color w:val="1F1F1F"/>
-          <w:sz w:val="35"/>
-          <w:szCs w:val="35"/>
+          <w:noProof/>
           <w:lang w:eastAsia="es-PE"/>
         </w:rPr>
-      </w:pPr>
-      <w:r>
-        <w:rPr>
-          <w:rFonts w:ascii="Arial" w:eastAsia="Times New Roman" w:hAnsi="Arial" w:cs="Arial"/>
-          <w:color w:val="1F1F1F"/>
-          <w:sz w:val="35"/>
-          <w:szCs w:val="35"/>
-          <w:lang w:eastAsia="es-PE"/>
-        </w:rPr>
-        <w:t>Celda 9 — Evaluación con métricas ROUGE y BLEU</w:t>
-      </w:r>
-    </w:p>
-    <w:p>
-      <w:r>
         <w:drawing>
-          <wp:inline distT="0" distB="0" distL="0" distR="0" wp14:anchorId="62F36E19" wp14:editId="4E223B5A">
-            <wp:extent cx="5400040" cy="3210560"/>
-            <wp:effectExtent l="0" t="0" r="0" b="8890"/>
-            <wp:docPr id="19" name="Imagen 19"/>
+          <wp:inline distT="0" distB="0" distL="0" distR="0" wp14:anchorId="13CC51EF" wp14:editId="7BAA7274">
+            <wp:extent cx="5400040" cy="2475865"/>
+            <wp:effectExtent l="0" t="0" r="0" b="635"/>
+            <wp:docPr id="18" name="Imagen 18"/>
             <wp:cNvGraphicFramePr>
               <a:graphicFrameLocks xmlns:a="http://schemas.openxmlformats.org/drawingml/2006/main" noChangeAspect="1"/>
             </wp:cNvGraphicFramePr>
@@ -803,6 +829,74 @@
                   <pic:spPr>
                     <a:xfrm>
                       <a:off x="0" y="0"/>
+                      <a:ext cx="5400040" cy="2475865"/>
+                    </a:xfrm>
+                    <a:prstGeom prst="rect">
+                      <a:avLst/>
+                    </a:prstGeom>
+                  </pic:spPr>
+                </pic:pic>
+              </a:graphicData>
+            </a:graphic>
+          </wp:inline>
+        </w:drawing>
+      </w:r>
+    </w:p>
+    <w:p>
+      <w:pPr>
+        <w:shd w:val="clear" w:color="auto" w:fill="FFFFFF"/>
+        <w:spacing w:before="120" w:after="120" w:line="240" w:lineRule="auto"/>
+        <w:outlineLvl w:val="1"/>
+        <w:rPr>
+          <w:rFonts w:ascii="Arial" w:eastAsia="Times New Roman" w:hAnsi="Arial" w:cs="Arial"/>
+          <w:color w:val="1F1F1F"/>
+          <w:sz w:val="35"/>
+          <w:szCs w:val="35"/>
+          <w:lang w:eastAsia="es-PE"/>
+        </w:rPr>
+      </w:pPr>
+      <w:r>
+        <w:rPr>
+          <w:rFonts w:ascii="Arial" w:eastAsia="Times New Roman" w:hAnsi="Arial" w:cs="Arial"/>
+          <w:color w:val="1F1F1F"/>
+          <w:sz w:val="35"/>
+          <w:szCs w:val="35"/>
+          <w:lang w:eastAsia="es-PE"/>
+        </w:rPr>
+        <w:t>Celda 9 — Evaluación con métricas ROUGE y BLEU</w:t>
+      </w:r>
+    </w:p>
+    <w:p>
+      <w:r>
+        <w:rPr>
+          <w:noProof/>
+          <w:lang w:eastAsia="es-PE"/>
+        </w:rPr>
+        <w:lastRenderedPageBreak/>
+        <w:drawing>
+          <wp:inline distT="0" distB="0" distL="0" distR="0" wp14:anchorId="62F36E19" wp14:editId="4E223B5A">
+            <wp:extent cx="5400040" cy="3210560"/>
+            <wp:effectExtent l="0" t="0" r="0" b="8890"/>
+            <wp:docPr id="19" name="Imagen 19"/>
+            <wp:cNvGraphicFramePr>
+              <a:graphicFrameLocks xmlns:a="http://schemas.openxmlformats.org/drawingml/2006/main" noChangeAspect="1"/>
+            </wp:cNvGraphicFramePr>
+            <a:graphic xmlns:a="http://schemas.openxmlformats.org/drawingml/2006/main">
+              <a:graphicData uri="http://schemas.openxmlformats.org/drawingml/2006/picture">
+                <pic:pic xmlns:pic="http://schemas.openxmlformats.org/drawingml/2006/picture">
+                  <pic:nvPicPr>
+                    <pic:cNvPr id="1" name=""/>
+                    <pic:cNvPicPr/>
+                  </pic:nvPicPr>
+                  <pic:blipFill>
+                    <a:blip r:embed="rId22"/>
+                    <a:stretch>
+                      <a:fillRect/>
+                    </a:stretch>
+                  </pic:blipFill>
+                  <pic:spPr>
+                    <a:xfrm>
+                      <a:off x="0" y="0"/>
                       <a:ext cx="5400040" cy="3210560"/>
                     </a:xfrm>
                     <a:prstGeom prst="rect">
@@ -815,8 +909,6 @@
           </wp:inline>
         </w:drawing>
       </w:r>
-      <w:bookmarkStart w:id="0" w:name="_GoBack"/>
-      <w:bookmarkEnd w:id="0"/>
     </w:p>
     <w:sectPr>
       <w:pgSz w:w="11906" w:h="16838"/>

</xml_diff>

<commit_message>
se refactoriza resultados con modelo fine tuning completado
</commit_message>
<xml_diff>
--- a/PruebasEntornoLocal.docx
+++ b/PruebasEntornoLocal.docx
@@ -694,8 +694,6 @@
           </wp:inline>
         </w:drawing>
       </w:r>
-      <w:bookmarkStart w:id="0" w:name="_GoBack"/>
-      <w:bookmarkEnd w:id="0"/>
     </w:p>
     <w:p>
       <w:r>
@@ -748,6 +746,57 @@
     </w:p>
     <w:p>
       <w:r>
+        <w:t xml:space="preserve">**** 12 </w:t>
+      </w:r>
+      <w:proofErr w:type="spellStart"/>
+      <w:r>
+        <w:t>pdfs</w:t>
+      </w:r>
+      <w:proofErr w:type="spellEnd"/>
+    </w:p>
+    <w:p>
+      <w:r>
+        <w:drawing>
+          <wp:inline distT="0" distB="0" distL="0" distR="0" wp14:anchorId="4E7B1465" wp14:editId="53F6A5F6">
+            <wp:extent cx="5400040" cy="2907665"/>
+            <wp:effectExtent l="0" t="0" r="0" b="6985"/>
+            <wp:docPr id="15" name="Imagen 15"/>
+            <wp:cNvGraphicFramePr>
+              <a:graphicFrameLocks xmlns:a="http://schemas.openxmlformats.org/drawingml/2006/main" noChangeAspect="1"/>
+            </wp:cNvGraphicFramePr>
+            <a:graphic xmlns:a="http://schemas.openxmlformats.org/drawingml/2006/main">
+              <a:graphicData uri="http://schemas.openxmlformats.org/drawingml/2006/picture">
+                <pic:pic xmlns:pic="http://schemas.openxmlformats.org/drawingml/2006/picture">
+                  <pic:nvPicPr>
+                    <pic:cNvPr id="1" name=""/>
+                    <pic:cNvPicPr/>
+                  </pic:nvPicPr>
+                  <pic:blipFill>
+                    <a:blip r:embed="rId20"/>
+                    <a:stretch>
+                      <a:fillRect/>
+                    </a:stretch>
+                  </pic:blipFill>
+                  <pic:spPr>
+                    <a:xfrm>
+                      <a:off x="0" y="0"/>
+                      <a:ext cx="5400040" cy="2907665"/>
+                    </a:xfrm>
+                    <a:prstGeom prst="rect">
+                      <a:avLst/>
+                    </a:prstGeom>
+                  </pic:spPr>
+                </pic:pic>
+              </a:graphicData>
+            </a:graphic>
+          </wp:inline>
+        </w:drawing>
+      </w:r>
+      <w:bookmarkStart w:id="0" w:name="_GoBack"/>
+      <w:bookmarkEnd w:id="0"/>
+    </w:p>
+    <w:p>
+      <w:r>
         <w:t>Guardar modelo y curva de perdida</w:t>
       </w:r>
     </w:p>
@@ -773,7 +822,7 @@
                     <pic:cNvPicPr/>
                   </pic:nvPicPr>
                   <pic:blipFill>
-                    <a:blip r:embed="rId20"/>
+                    <a:blip r:embed="rId21"/>
                     <a:stretch>
                       <a:fillRect/>
                     </a:stretch>
@@ -805,6 +854,7 @@
           <w:noProof/>
           <w:lang w:eastAsia="es-PE"/>
         </w:rPr>
+        <w:lastRenderedPageBreak/>
         <w:drawing>
           <wp:inline distT="0" distB="0" distL="0" distR="0" wp14:anchorId="13CC51EF" wp14:editId="7BAA7274">
             <wp:extent cx="5400040" cy="2475865"/>
@@ -821,7 +871,7 @@
                     <pic:cNvPicPr/>
                   </pic:nvPicPr>
                   <pic:blipFill>
-                    <a:blip r:embed="rId21"/>
+                    <a:blip r:embed="rId22"/>
                     <a:stretch>
                       <a:fillRect/>
                     </a:stretch>
@@ -872,7 +922,6 @@
           <w:noProof/>
           <w:lang w:eastAsia="es-PE"/>
         </w:rPr>
-        <w:lastRenderedPageBreak/>
         <w:drawing>
           <wp:inline distT="0" distB="0" distL="0" distR="0" wp14:anchorId="62F36E19" wp14:editId="4E223B5A">
             <wp:extent cx="5400040" cy="3210560"/>
@@ -889,7 +938,7 @@
                     <pic:cNvPicPr/>
                   </pic:nvPicPr>
                   <pic:blipFill>
-                    <a:blip r:embed="rId22"/>
+                    <a:blip r:embed="rId23"/>
                     <a:stretch>
                       <a:fillRect/>
                     </a:stretch>

</xml_diff>